<commit_message>
Added Hospital Queries and Modified the Mapping
</commit_message>
<xml_diff>
--- a/DataBase Tasks/Mapping/Hospital Mapping.docx
+++ b/DataBase Tasks/Mapping/Hospital Mapping.docx
@@ -563,12 +563,26 @@
                 <w:u w:val="single"/>
               </w:rPr>
             </w:pPr>
+            <w:proofErr w:type="spellStart"/>
             <w:r>
               <w:rPr>
                 <w:u w:val="single"/>
               </w:rPr>
-              <w:t>DID</w:t>
-            </w:r>
+              <w:t>D</w:t>
+            </w:r>
+            <w:r>
+              <w:rPr>
+                <w:u w:val="single"/>
+              </w:rPr>
+              <w:t>r</w:t>
+            </w:r>
+            <w:r>
+              <w:rPr>
+                <w:u w:val="single"/>
+              </w:rPr>
+              <w:t>ID</w:t>
+            </w:r>
+            <w:proofErr w:type="spellEnd"/>
           </w:p>
         </w:tc>
       </w:tr>
@@ -653,7 +667,15 @@
             <w:tcW w:w="1179" w:type="dxa"/>
           </w:tcPr>
           <w:p>
-            <w:r>
+            <w:pPr>
+              <w:rPr>
+                <w:u w:val="dotted"/>
+              </w:rPr>
+            </w:pPr>
+            <w:r>
+              <w:rPr>
+                <w:u w:val="dotted"/>
+              </w:rPr>
               <w:t>AID</w:t>
             </w:r>
           </w:p>

</xml_diff>